<commit_message>
Limoneno en lugar de THF/DMF, sin electrohilado y cartucho retornable
- Estudio_EPS_AVU_3_etapas.pdf movido de la raíz a referencias/ y registrado
  en README y CLAUDE.md.
- Malla: unicel disuelto en d-limoneno (propuesta a investigar) e inversión
  de fases; el electrohilado se descarta por precio. Nota agregada donde se
  mencionaban THF y DMF (CLAUDE.md, contexto, consulta y propuestas).
- Mantenimiento: cartucho retornable.
- Nueva sección "Por investigar" en CLAUDE.md: capacidad, reúso, poro,
  limoneno residual, recuperación del solvente.
- Punto 6 (md y docx) y redacción: el descarte del limoneno se aclara como
  "usado tal cual como esponja". Secciones 2 y 5 recontadas (961 y 1213).
- Ruta de epoxidación: se documenta la Ruta B del Estudio (peracético con
  resina) y sus choques con la ruta perfórmica vigente; queda por decidir.

Co-Authored-By: Claude Opus 5.5 <noreply@anthropic.com>
Claude-Session: https://claude.ai/code/session_01NfmgzsCVWJem3YEBEnX1d7
</commit_message>
<xml_diff>
--- a/entregables/Formato_obligatorio_con_Punto_6_Propuestas_descartadas.docx
+++ b/entregables/Formato_obligatorio_con_Punto_6_Propuestas_descartadas.docx
@@ -1742,7 +1742,7 @@
           <w:b/>
           <w:sz w:val="20"/>
         </w:rPr>
-        <w:t xml:space="preserve">8. Unicel disuelto en limoneno. </w:t>
+        <w:t xml:space="preserve">8. Unicel disuelto en limoneno usado tal cual como esponja. </w:t>
       </w:r>
       <w:r>
         <w:rPr>
@@ -1750,7 +1750,7 @@
           <w:b w:val="0"/>
           <w:sz w:val="20"/>
         </w:rPr>
-        <w:t>No encontramos evidencia de que ese material se exprima y se reutilice.</w:t>
+        <w:t>No encontramos evidencia de que ese material se exprima y se reutilice. El limoneno se conserva, pero solo como solvente para fabricar la malla.</w:t>
       </w:r>
     </w:p>
     <w:p>

</xml_diff>

<commit_message>
Disolvente: acetona con baño de agua; d-limoneno como alternativa
- Nuevo documentos/actualizacion-disolvente-acetona.md (proceso de partida,
  comparación de residuos con el limoneno, regulación y seguridad), sin las
  preguntas para la doctora.
- Reemplazado el limoneno por acetona en CLAUDE.md (material, riesgos, por
  investigar, experimentos), README, redacción (secciones 2 y 5: 929 y 1208
  caracteres), notas de la doctora y notas sobre THF/DMF.
- Punto 6 (md y docx): el limoneno queda como alternativa por sus residuos.
- Riesgos nuevos: acetona muy inflamable, daña el PETG, figura como producto
  químico esencial (por verificar en el DOF) y queda en el límite de disolver
  el poliestireno según Hansen (RED ≈ 1.0).

Co-Authored-By: Claude Opus 5.5 <noreply@anthropic.com>
Claude-Session: https://claude.ai/code/session_01NfmgzsCVWJem3YEBEnX1d7
</commit_message>
<xml_diff>
--- a/entregables/Formato_obligatorio_con_Punto_6_Propuestas_descartadas.docx
+++ b/entregables/Formato_obligatorio_con_Punto_6_Propuestas_descartadas.docx
@@ -1742,7 +1742,7 @@
           <w:b/>
           <w:sz w:val="20"/>
         </w:rPr>
-        <w:t xml:space="preserve">8. Unicel disuelto en limoneno usado tal cual como esponja. </w:t>
+        <w:t xml:space="preserve">8. Unicel disuelto en limoneno. </w:t>
       </w:r>
       <w:r>
         <w:rPr>
@@ -1750,7 +1750,7 @@
           <w:b w:val="0"/>
           <w:sz w:val="20"/>
         </w:rPr>
-        <w:t>No encontramos evidencia de que ese material se exprima y se reutilice. El limoneno se conserva, pero solo como solvente para fabricar la malla.</w:t>
+        <w:t>Como esponja que se exprime, no encontramos evidencia de que se reutilice. Como disolvente para fabricar la malla queda como alternativa a la acetona: deja más restos de disolvente en la malla y es tóxico para organismos acuáticos.</w:t>
       </w:r>
     </w:p>
     <w:p>

</xml_diff>